<commit_message>
feat: integrate Chilean holiday calendar to prevent duplicate holiday assignments in December
</commit_message>
<xml_diff>
--- a/Sistema_de_Gestion_de_Turnos.docx
+++ b/Sistema_de_Gestion_de_Turnos.docx
@@ -1149,7 +1149,7 @@
                 <w:color w:val="1F2937"/>
                 <w:sz w:val="17"/>
               </w:rPr>
-              <w:t>RF-05</w:t>
+              <w:t>RF-04A</w:t>
             </w:r>
           </w:p>
         </w:tc>
@@ -1171,6 +1171,72 @@
                 <w:color w:val="1F2937"/>
                 <w:sz w:val="17"/>
               </w:rPr>
+              <w:t>Evitar repetición de feriados</w:t>
+            </w:r>
+          </w:p>
+        </w:tc>
+        <w:tc>
+          <w:tcPr>
+            <w:tcW w:type="dxa" w:w="6984"/>
+            <w:vAlign w:val="center"/>
+            <w:shd w:fill="F0FDFA"/>
+          </w:tcPr>
+          <w:p>
+            <w:pPr>
+              <w:spacing w:after="0"/>
+            </w:pPr>
+            <w:r/>
+            <w:r>
+              <w:rPr>
+                <w:rFonts w:ascii="Aptos" w:hAnsi="Aptos"/>
+                <w:b w:val="0"/>
+                <w:color w:val="1F2937"/>
+                <w:sz w:val="17"/>
+              </w:rPr>
+              <w:t>En diciembre se evita repetir el mismo feriado nacional chileno del año anterior cuando existe otra alternativa.</w:t>
+            </w:r>
+          </w:p>
+        </w:tc>
+      </w:tr>
+      <w:tr>
+        <w:tc>
+          <w:tcPr>
+            <w:tcW w:type="dxa" w:w="792"/>
+            <w:vAlign w:val="center"/>
+          </w:tcPr>
+          <w:p>
+            <w:pPr>
+              <w:spacing w:after="0"/>
+            </w:pPr>
+            <w:r/>
+            <w:r>
+              <w:rPr>
+                <w:rFonts w:ascii="Aptos" w:hAnsi="Aptos"/>
+                <w:b w:val="0"/>
+                <w:color w:val="1F2937"/>
+                <w:sz w:val="17"/>
+              </w:rPr>
+              <w:t>RF-05</w:t>
+            </w:r>
+          </w:p>
+        </w:tc>
+        <w:tc>
+          <w:tcPr>
+            <w:tcW w:type="dxa" w:w="2376"/>
+            <w:vAlign w:val="center"/>
+          </w:tcPr>
+          <w:p>
+            <w:pPr>
+              <w:spacing w:after="0"/>
+            </w:pPr>
+            <w:r/>
+            <w:r>
+              <w:rPr>
+                <w:rFonts w:ascii="Aptos" w:hAnsi="Aptos"/>
+                <w:b w:val="0"/>
+                <w:color w:val="1F2937"/>
+                <w:sz w:val="17"/>
+              </w:rPr>
               <w:t>Cerrar mes</w:t>
             </w:r>
           </w:p>
@@ -1179,7 +1245,6 @@
           <w:tcPr>
             <w:tcW w:type="dxa" w:w="6984"/>
             <w:vAlign w:val="center"/>
-            <w:shd w:fill="F0FDFA"/>
           </w:tcPr>
           <w:p>
             <w:pPr>
@@ -1203,6 +1268,7 @@
           <w:tcPr>
             <w:tcW w:type="dxa" w:w="792"/>
             <w:vAlign w:val="center"/>
+            <w:shd w:fill="F0FDFA"/>
           </w:tcPr>
           <w:p>
             <w:pPr>
@@ -1224,6 +1290,7 @@
           <w:tcPr>
             <w:tcW w:type="dxa" w:w="2376"/>
             <w:vAlign w:val="center"/>
+            <w:shd w:fill="F0FDFA"/>
           </w:tcPr>
           <w:p>
             <w:pPr>
@@ -1245,6 +1312,7 @@
           <w:tcPr>
             <w:tcW w:type="dxa" w:w="6984"/>
             <w:vAlign w:val="center"/>
+            <w:shd w:fill="F0FDFA"/>
           </w:tcPr>
           <w:p>
             <w:pPr>
@@ -1268,7 +1336,6 @@
           <w:tcPr>
             <w:tcW w:type="dxa" w:w="792"/>
             <w:vAlign w:val="center"/>
-            <w:shd w:fill="F0FDFA"/>
           </w:tcPr>
           <w:p>
             <w:pPr>
@@ -1290,7 +1357,6 @@
           <w:tcPr>
             <w:tcW w:type="dxa" w:w="2376"/>
             <w:vAlign w:val="center"/>
-            <w:shd w:fill="F0FDFA"/>
           </w:tcPr>
           <w:p>
             <w:pPr>
@@ -1312,7 +1378,6 @@
           <w:tcPr>
             <w:tcW w:type="dxa" w:w="6984"/>
             <w:vAlign w:val="center"/>
-            <w:shd w:fill="F0FDFA"/>
           </w:tcPr>
           <w:p>
             <w:pPr>
@@ -1336,6 +1401,7 @@
           <w:tcPr>
             <w:tcW w:type="dxa" w:w="792"/>
             <w:vAlign w:val="center"/>
+            <w:shd w:fill="F0FDFA"/>
           </w:tcPr>
           <w:p>
             <w:pPr>
@@ -1357,6 +1423,7 @@
           <w:tcPr>
             <w:tcW w:type="dxa" w:w="2376"/>
             <w:vAlign w:val="center"/>
+            <w:shd w:fill="F0FDFA"/>
           </w:tcPr>
           <w:p>
             <w:pPr>
@@ -1378,6 +1445,7 @@
           <w:tcPr>
             <w:tcW w:type="dxa" w:w="6984"/>
             <w:vAlign w:val="center"/>
+            <w:shd w:fill="F0FDFA"/>
           </w:tcPr>
           <w:p>
             <w:pPr>
@@ -1720,6 +1788,51 @@
                 <w:color w:val="1F2937"/>
                 <w:sz w:val="17"/>
               </w:rPr>
+              <w:t>Regla anual</w:t>
+            </w:r>
+          </w:p>
+        </w:tc>
+        <w:tc>
+          <w:tcPr>
+            <w:tcW w:type="dxa" w:w="7920"/>
+            <w:vAlign w:val="center"/>
+          </w:tcPr>
+          <w:p>
+            <w:pPr>
+              <w:spacing w:after="0"/>
+            </w:pPr>
+            <w:r/>
+            <w:r>
+              <w:rPr>
+                <w:rFonts w:ascii="Aptos" w:hAnsi="Aptos"/>
+                <w:b w:val="0"/>
+                <w:color w:val="1F2937"/>
+                <w:sz w:val="17"/>
+              </w:rPr>
+              <w:t>Calendario nacional chileno; los feriados móviles se comparan por nombre y se advierten los casos sin alternativa.</w:t>
+            </w:r>
+          </w:p>
+        </w:tc>
+      </w:tr>
+      <w:tr>
+        <w:tc>
+          <w:tcPr>
+            <w:tcW w:type="dxa" w:w="2232"/>
+            <w:vAlign w:val="center"/>
+            <w:shd w:fill="F0FDFA"/>
+          </w:tcPr>
+          <w:p>
+            <w:pPr>
+              <w:spacing w:after="0"/>
+            </w:pPr>
+            <w:r/>
+            <w:r>
+              <w:rPr>
+                <w:rFonts w:ascii="Aptos" w:hAnsi="Aptos"/>
+                <w:b w:val="0"/>
+                <w:color w:val="1F2937"/>
+                <w:sz w:val="17"/>
+              </w:rPr>
               <w:t>Mantenibilidad</w:t>
             </w:r>
           </w:p>
@@ -1728,6 +1841,7 @@
           <w:tcPr>
             <w:tcW w:type="dxa" w:w="7920"/>
             <w:vAlign w:val="center"/>
+            <w:shd w:fill="F0FDFA"/>
           </w:tcPr>
           <w:p>
             <w:pPr>
@@ -2777,6 +2891,15 @@
         <w:spacing w:after="60"/>
       </w:pPr>
       <w:r>
+        <w:t>En diciembre se consulta el calendario nacional chileno para evitar repetir el mismo feriado del año anterior; si no hay alternativa, el sistema asigna y advierte.</w:t>
+      </w:r>
+    </w:p>
+    <w:p>
+      <w:pPr>
+        <w:pStyle w:val="ListBullet"/>
+        <w:spacing w:after="60"/>
+      </w:pPr>
+      <w:r>
         <w:t>La separación mínima de semanas reduce la posibilidad de asignaciones demasiado cercanas.</w:t>
       </w:r>
     </w:p>

</xml_diff>